<commit_message>
Diccionario de datos (conceptual, logico, fisico), MER conceptual y logico, borde en manuales
</commit_message>
<xml_diff>
--- a/05. DOCUMENTACION/02. MANUAL TECNICO/MANUAL_TECNICO_EUREKA_RESTFUL_JAVA_CONBDD_GR01.docx
+++ b/05. DOCUMENTACION/02. MANUAL TECNICO/MANUAL_TECNICO_EUREKA_RESTFUL_JAVA_CONBDD_GR01.docx
@@ -278,11 +278,11 @@
         <w:sectPr>
           <w:pgSz w:w="11906" w:h="16838"/>
           <w:pgMar w:top="1200" w:right="1440" w:bottom="1200" w:left="1440" w:header="708" w:footer="708" w:gutter="0"/>
-          <w:pgBorders>
-            <w:top w:val="single" w:sz="24" w:space="24" w:color="1F3864"/>
-            <w:left w:val="single" w:sz="48" w:space="24" w:color="1F3864"/>
-            <w:bottom w:val="single" w:sz="24" w:space="24" w:color="1F3864"/>
-            <w:right w:val="single" w:sz="24" w:space="24" w:color="1F3864"/>
+          <w:pgBorders w:offsetFrom="page">
+            <w:top w:val="dashDotStroked" w:sz="24" w:space="24" w:color="4472C4" w:themeColor="accent1"/>
+            <w:left w:val="dashDotStroked" w:sz="24" w:space="24" w:color="4472C4" w:themeColor="accent1"/>
+            <w:bottom w:val="dashDotStroked" w:sz="24" w:space="24" w:color="4472C4" w:themeColor="accent1"/>
+            <w:right w:val="dashDotStroked" w:sz="24" w:space="24" w:color="4472C4" w:themeColor="accent1"/>
           </w:pgBorders>
           <w:cols w:space="720"/>
           <w:docGrid w:linePitch="360"/>
@@ -3184,12 +3184,6 @@
         <w:gridCol w:w="6726"/>
       </w:tblGrid>
       <w:tr>
-        <w:tblPrEx>
-          <w:tblCellMar>
-            <w:top w:w="0" w:type="dxa"/>
-            <w:bottom w:w="0" w:type="dxa"/>
-          </w:tblCellMar>
-        </w:tblPrEx>
         <w:trPr>
           <w:tblHeader/>
         </w:trPr>
@@ -3263,12 +3257,6 @@
         </w:tc>
       </w:tr>
       <w:tr>
-        <w:tblPrEx>
-          <w:tblCellMar>
-            <w:top w:w="0" w:type="dxa"/>
-            <w:bottom w:w="0" w:type="dxa"/>
-          </w:tblCellMar>
-        </w:tblPrEx>
         <w:trPr>
           <w:cantSplit/>
         </w:trPr>
@@ -3332,12 +3320,6 @@
         </w:tc>
       </w:tr>
       <w:tr>
-        <w:tblPrEx>
-          <w:tblCellMar>
-            <w:top w:w="0" w:type="dxa"/>
-            <w:bottom w:w="0" w:type="dxa"/>
-          </w:tblCellMar>
-        </w:tblPrEx>
         <w:trPr>
           <w:cantSplit/>
         </w:trPr>
@@ -3402,12 +3384,6 @@
         </w:tc>
       </w:tr>
       <w:tr>
-        <w:tblPrEx>
-          <w:tblCellMar>
-            <w:top w:w="0" w:type="dxa"/>
-            <w:bottom w:w="0" w:type="dxa"/>
-          </w:tblCellMar>
-        </w:tblPrEx>
         <w:trPr>
           <w:cantSplit/>
         </w:trPr>
@@ -3519,12 +3495,6 @@
         </w:tc>
       </w:tr>
       <w:tr>
-        <w:tblPrEx>
-          <w:tblCellMar>
-            <w:top w:w="0" w:type="dxa"/>
-            <w:bottom w:w="0" w:type="dxa"/>
-          </w:tblCellMar>
-        </w:tblPrEx>
         <w:trPr>
           <w:cantSplit/>
         </w:trPr>
@@ -3604,12 +3574,6 @@
         </w:tc>
       </w:tr>
       <w:tr>
-        <w:tblPrEx>
-          <w:tblCellMar>
-            <w:top w:w="0" w:type="dxa"/>
-            <w:bottom w:w="0" w:type="dxa"/>
-          </w:tblCellMar>
-        </w:tblPrEx>
         <w:trPr>
           <w:cantSplit/>
         </w:trPr>
@@ -3673,12 +3637,6 @@
         </w:tc>
       </w:tr>
       <w:tr>
-        <w:tblPrEx>
-          <w:tblCellMar>
-            <w:top w:w="0" w:type="dxa"/>
-            <w:bottom w:w="0" w:type="dxa"/>
-          </w:tblCellMar>
-        </w:tblPrEx>
         <w:trPr>
           <w:cantSplit/>
         </w:trPr>
@@ -3774,12 +3732,6 @@
         </w:tc>
       </w:tr>
       <w:tr>
-        <w:tblPrEx>
-          <w:tblCellMar>
-            <w:top w:w="0" w:type="dxa"/>
-            <w:bottom w:w="0" w:type="dxa"/>
-          </w:tblCellMar>
-        </w:tblPrEx>
         <w:trPr>
           <w:cantSplit/>
         </w:trPr>
@@ -3843,12 +3795,6 @@
         </w:tc>
       </w:tr>
       <w:tr>
-        <w:tblPrEx>
-          <w:tblCellMar>
-            <w:top w:w="0" w:type="dxa"/>
-            <w:bottom w:w="0" w:type="dxa"/>
-          </w:tblCellMar>
-        </w:tblPrEx>
         <w:trPr>
           <w:cantSplit/>
         </w:trPr>
@@ -4397,12 +4343,6 @@
         <w:gridCol w:w="2000"/>
       </w:tblGrid>
       <w:tr>
-        <w:tblPrEx>
-          <w:tblCellMar>
-            <w:top w:w="0" w:type="dxa"/>
-            <w:bottom w:w="0" w:type="dxa"/>
-          </w:tblCellMar>
-        </w:tblPrEx>
         <w:trPr>
           <w:tblHeader/>
         </w:trPr>
@@ -4510,12 +4450,6 @@
         </w:tc>
       </w:tr>
       <w:tr>
-        <w:tblPrEx>
-          <w:tblCellMar>
-            <w:top w:w="0" w:type="dxa"/>
-            <w:bottom w:w="0" w:type="dxa"/>
-          </w:tblCellMar>
-        </w:tblPrEx>
         <w:trPr>
           <w:cantSplit/>
         </w:trPr>
@@ -4624,12 +4558,6 @@
         </w:tc>
       </w:tr>
       <w:tr>
-        <w:tblPrEx>
-          <w:tblCellMar>
-            <w:top w:w="0" w:type="dxa"/>
-            <w:bottom w:w="0" w:type="dxa"/>
-          </w:tblCellMar>
-        </w:tblPrEx>
         <w:trPr>
           <w:cantSplit/>
         </w:trPr>
@@ -4731,12 +4659,6 @@
         </w:tc>
       </w:tr>
       <w:tr>
-        <w:tblPrEx>
-          <w:tblCellMar>
-            <w:top w:w="0" w:type="dxa"/>
-            <w:bottom w:w="0" w:type="dxa"/>
-          </w:tblCellMar>
-        </w:tblPrEx>
         <w:trPr>
           <w:cantSplit/>
         </w:trPr>
@@ -4838,12 +4760,6 @@
         </w:tc>
       </w:tr>
       <w:tr>
-        <w:tblPrEx>
-          <w:tblCellMar>
-            <w:top w:w="0" w:type="dxa"/>
-            <w:bottom w:w="0" w:type="dxa"/>
-          </w:tblCellMar>
-        </w:tblPrEx>
         <w:trPr>
           <w:cantSplit/>
         </w:trPr>
@@ -4945,12 +4861,6 @@
         </w:tc>
       </w:tr>
       <w:tr>
-        <w:tblPrEx>
-          <w:tblCellMar>
-            <w:top w:w="0" w:type="dxa"/>
-            <w:bottom w:w="0" w:type="dxa"/>
-          </w:tblCellMar>
-        </w:tblPrEx>
         <w:trPr>
           <w:cantSplit/>
         </w:trPr>
@@ -5068,12 +4978,6 @@
         </w:tc>
       </w:tr>
       <w:tr>
-        <w:tblPrEx>
-          <w:tblCellMar>
-            <w:top w:w="0" w:type="dxa"/>
-            <w:bottom w:w="0" w:type="dxa"/>
-          </w:tblCellMar>
-        </w:tblPrEx>
         <w:trPr>
           <w:cantSplit/>
         </w:trPr>
@@ -5166,12 +5070,6 @@
         </w:tc>
       </w:tr>
       <w:tr>
-        <w:tblPrEx>
-          <w:tblCellMar>
-            <w:top w:w="0" w:type="dxa"/>
-            <w:bottom w:w="0" w:type="dxa"/>
-          </w:tblCellMar>
-        </w:tblPrEx>
         <w:trPr>
           <w:cantSplit/>
         </w:trPr>
@@ -5264,12 +5162,6 @@
         </w:tc>
       </w:tr>
       <w:tr>
-        <w:tblPrEx>
-          <w:tblCellMar>
-            <w:top w:w="0" w:type="dxa"/>
-            <w:bottom w:w="0" w:type="dxa"/>
-          </w:tblCellMar>
-        </w:tblPrEx>
         <w:trPr>
           <w:cantSplit/>
         </w:trPr>
@@ -5387,12 +5279,6 @@
         </w:tc>
       </w:tr>
       <w:tr>
-        <w:tblPrEx>
-          <w:tblCellMar>
-            <w:top w:w="0" w:type="dxa"/>
-            <w:bottom w:w="0" w:type="dxa"/>
-          </w:tblCellMar>
-        </w:tblPrEx>
         <w:trPr>
           <w:cantSplit/>
         </w:trPr>
@@ -5517,12 +5403,6 @@
         </w:tc>
       </w:tr>
       <w:tr>
-        <w:tblPrEx>
-          <w:tblCellMar>
-            <w:top w:w="0" w:type="dxa"/>
-            <w:bottom w:w="0" w:type="dxa"/>
-          </w:tblCellMar>
-        </w:tblPrEx>
         <w:trPr>
           <w:cantSplit/>
         </w:trPr>
@@ -6153,6 +6033,9 @@
         <w:shd w:val="clear" w:color="auto" w:fill="F2F5FB"/>
         <w:spacing w:line="252" w:lineRule="auto"/>
         <w:ind w:left="200"/>
+        <w:rPr>
+          <w:lang w:val="en-US"/>
+        </w:rPr>
       </w:pPr>
       <w:r>
         <w:rPr>
@@ -6214,39 +6097,9 @@
           <w:color w:val="1F3864"/>
           <w:sz w:val="17"/>
           <w:szCs w:val="17"/>
-        </w:rPr>
-        <w:t>PRIMARY KEY (</w:t>
-      </w:r>
-      <w:proofErr w:type="spellStart"/>
-      <w:r>
-        <w:rPr>
-          <w:rFonts w:ascii="Consolas" w:eastAsia="Consolas" w:hAnsi="Consolas" w:cs="Consolas"/>
-          <w:color w:val="1F3864"/>
-          <w:sz w:val="17"/>
-          <w:szCs w:val="17"/>
-        </w:rPr>
-        <w:t>chr_cuencodigo</w:t>
-      </w:r>
-      <w:proofErr w:type="spellEnd"/>
-      <w:proofErr w:type="gramStart"/>
-      <w:r>
-        <w:rPr>
-          <w:rFonts w:ascii="Consolas" w:eastAsia="Consolas" w:hAnsi="Consolas" w:cs="Consolas"/>
-          <w:color w:val="1F3864"/>
-          <w:sz w:val="17"/>
-          <w:szCs w:val="17"/>
-        </w:rPr>
-        <w:t>) )</w:t>
-      </w:r>
-      <w:proofErr w:type="gramEnd"/>
-      <w:r>
-        <w:rPr>
-          <w:rFonts w:ascii="Consolas" w:eastAsia="Consolas" w:hAnsi="Consolas" w:cs="Consolas"/>
-          <w:color w:val="1F3864"/>
-          <w:sz w:val="17"/>
-          <w:szCs w:val="17"/>
-        </w:rPr>
-        <w:t>;</w:t>
+          <w:lang w:val="en-US"/>
+        </w:rPr>
+        <w:t>PRIMARY KEY (chr_cuencodigo) );</w:t>
       </w:r>
     </w:p>
     <w:p>
@@ -6477,12 +6330,6 @@
         <w:gridCol w:w="3826"/>
       </w:tblGrid>
       <w:tr>
-        <w:tblPrEx>
-          <w:tblCellMar>
-            <w:top w:w="0" w:type="dxa"/>
-            <w:bottom w:w="0" w:type="dxa"/>
-          </w:tblCellMar>
-        </w:tblPrEx>
         <w:trPr>
           <w:tblHeader/>
         </w:trPr>
@@ -6624,12 +6471,6 @@
         </w:tc>
       </w:tr>
       <w:tr>
-        <w:tblPrEx>
-          <w:tblCellMar>
-            <w:top w:w="0" w:type="dxa"/>
-            <w:bottom w:w="0" w:type="dxa"/>
-          </w:tblCellMar>
-        </w:tblPrEx>
         <w:trPr>
           <w:cantSplit/>
         </w:trPr>
@@ -6751,12 +6592,6 @@
         </w:tc>
       </w:tr>
       <w:tr>
-        <w:tblPrEx>
-          <w:tblCellMar>
-            <w:top w:w="0" w:type="dxa"/>
-            <w:bottom w:w="0" w:type="dxa"/>
-          </w:tblCellMar>
-        </w:tblPrEx>
         <w:trPr>
           <w:cantSplit/>
         </w:trPr>
@@ -6878,12 +6713,6 @@
         </w:tc>
       </w:tr>
       <w:tr>
-        <w:tblPrEx>
-          <w:tblCellMar>
-            <w:top w:w="0" w:type="dxa"/>
-            <w:bottom w:w="0" w:type="dxa"/>
-          </w:tblCellMar>
-        </w:tblPrEx>
         <w:trPr>
           <w:cantSplit/>
         </w:trPr>
@@ -7005,12 +6834,6 @@
         </w:tc>
       </w:tr>
       <w:tr>
-        <w:tblPrEx>
-          <w:tblCellMar>
-            <w:top w:w="0" w:type="dxa"/>
-            <w:bottom w:w="0" w:type="dxa"/>
-          </w:tblCellMar>
-        </w:tblPrEx>
         <w:trPr>
           <w:cantSplit/>
         </w:trPr>
@@ -7171,12 +6994,6 @@
         <w:gridCol w:w="6426"/>
       </w:tblGrid>
       <w:tr>
-        <w:tblPrEx>
-          <w:tblCellMar>
-            <w:top w:w="0" w:type="dxa"/>
-            <w:bottom w:w="0" w:type="dxa"/>
-          </w:tblCellMar>
-        </w:tblPrEx>
         <w:trPr>
           <w:tblHeader/>
         </w:trPr>
@@ -7250,12 +7067,6 @@
         </w:tc>
       </w:tr>
       <w:tr>
-        <w:tblPrEx>
-          <w:tblCellMar>
-            <w:top w:w="0" w:type="dxa"/>
-            <w:bottom w:w="0" w:type="dxa"/>
-          </w:tblCellMar>
-        </w:tblPrEx>
         <w:trPr>
           <w:cantSplit/>
         </w:trPr>
@@ -7328,12 +7139,6 @@
         </w:tc>
       </w:tr>
       <w:tr>
-        <w:tblPrEx>
-          <w:tblCellMar>
-            <w:top w:w="0" w:type="dxa"/>
-            <w:bottom w:w="0" w:type="dxa"/>
-          </w:tblCellMar>
-        </w:tblPrEx>
         <w:trPr>
           <w:cantSplit/>
         </w:trPr>
@@ -7413,12 +7218,6 @@
         </w:tc>
       </w:tr>
       <w:tr>
-        <w:tblPrEx>
-          <w:tblCellMar>
-            <w:top w:w="0" w:type="dxa"/>
-            <w:bottom w:w="0" w:type="dxa"/>
-          </w:tblCellMar>
-        </w:tblPrEx>
         <w:trPr>
           <w:cantSplit/>
         </w:trPr>
@@ -7482,12 +7281,6 @@
         </w:tc>
       </w:tr>
       <w:tr>
-        <w:tblPrEx>
-          <w:tblCellMar>
-            <w:top w:w="0" w:type="dxa"/>
-            <w:bottom w:w="0" w:type="dxa"/>
-          </w:tblCellMar>
-        </w:tblPrEx>
         <w:trPr>
           <w:cantSplit/>
         </w:trPr>
@@ -7567,12 +7360,6 @@
         </w:tc>
       </w:tr>
       <w:tr>
-        <w:tblPrEx>
-          <w:tblCellMar>
-            <w:top w:w="0" w:type="dxa"/>
-            <w:bottom w:w="0" w:type="dxa"/>
-          </w:tblCellMar>
-        </w:tblPrEx>
         <w:trPr>
           <w:cantSplit/>
         </w:trPr>
@@ -8384,12 +8171,6 @@
         <w:gridCol w:w="2400"/>
       </w:tblGrid>
       <w:tr>
-        <w:tblPrEx>
-          <w:tblCellMar>
-            <w:top w:w="0" w:type="dxa"/>
-            <w:bottom w:w="0" w:type="dxa"/>
-          </w:tblCellMar>
-        </w:tblPrEx>
         <w:trPr>
           <w:tblHeader/>
         </w:trPr>
@@ -8497,12 +8278,6 @@
         </w:tc>
       </w:tr>
       <w:tr>
-        <w:tblPrEx>
-          <w:tblCellMar>
-            <w:top w:w="0" w:type="dxa"/>
-            <w:bottom w:w="0" w:type="dxa"/>
-          </w:tblCellMar>
-        </w:tblPrEx>
         <w:trPr>
           <w:cantSplit/>
         </w:trPr>
@@ -8622,12 +8397,6 @@
         </w:tc>
       </w:tr>
       <w:tr>
-        <w:tblPrEx>
-          <w:tblCellMar>
-            <w:top w:w="0" w:type="dxa"/>
-            <w:bottom w:w="0" w:type="dxa"/>
-          </w:tblCellMar>
-        </w:tblPrEx>
         <w:trPr>
           <w:cantSplit/>
         </w:trPr>
@@ -8772,12 +8541,6 @@
         </w:tc>
       </w:tr>
       <w:tr>
-        <w:tblPrEx>
-          <w:tblCellMar>
-            <w:top w:w="0" w:type="dxa"/>
-            <w:bottom w:w="0" w:type="dxa"/>
-          </w:tblCellMar>
-        </w:tblPrEx>
         <w:trPr>
           <w:cantSplit/>
         </w:trPr>
@@ -8881,12 +8644,6 @@
         </w:tc>
       </w:tr>
       <w:tr>
-        <w:tblPrEx>
-          <w:tblCellMar>
-            <w:top w:w="0" w:type="dxa"/>
-            <w:bottom w:w="0" w:type="dxa"/>
-          </w:tblCellMar>
-        </w:tblPrEx>
         <w:trPr>
           <w:cantSplit/>
         </w:trPr>
@@ -9280,12 +9037,6 @@
         <w:gridCol w:w="3608"/>
       </w:tblGrid>
       <w:tr>
-        <w:tblPrEx>
-          <w:tblCellMar>
-            <w:top w:w="0" w:type="dxa"/>
-            <w:bottom w:w="0" w:type="dxa"/>
-          </w:tblCellMar>
-        </w:tblPrEx>
         <w:trPr>
           <w:tblHeader/>
         </w:trPr>
@@ -9427,12 +9178,6 @@
         </w:tc>
       </w:tr>
       <w:tr>
-        <w:tblPrEx>
-          <w:tblCellMar>
-            <w:top w:w="0" w:type="dxa"/>
-            <w:bottom w:w="0" w:type="dxa"/>
-          </w:tblCellMar>
-        </w:tblPrEx>
         <w:trPr>
           <w:cantSplit/>
         </w:trPr>
@@ -9570,12 +9315,6 @@
         </w:tc>
       </w:tr>
       <w:tr>
-        <w:tblPrEx>
-          <w:tblCellMar>
-            <w:top w:w="0" w:type="dxa"/>
-            <w:bottom w:w="0" w:type="dxa"/>
-          </w:tblCellMar>
-        </w:tblPrEx>
         <w:trPr>
           <w:cantSplit/>
         </w:trPr>
@@ -9722,12 +9461,6 @@
         </w:tc>
       </w:tr>
       <w:tr>
-        <w:tblPrEx>
-          <w:tblCellMar>
-            <w:top w:w="0" w:type="dxa"/>
-            <w:bottom w:w="0" w:type="dxa"/>
-          </w:tblCellMar>
-        </w:tblPrEx>
         <w:trPr>
           <w:cantSplit/>
         </w:trPr>
@@ -9849,12 +9582,6 @@
         </w:tc>
       </w:tr>
       <w:tr>
-        <w:tblPrEx>
-          <w:tblCellMar>
-            <w:top w:w="0" w:type="dxa"/>
-            <w:bottom w:w="0" w:type="dxa"/>
-          </w:tblCellMar>
-        </w:tblPrEx>
         <w:trPr>
           <w:cantSplit/>
         </w:trPr>
@@ -10024,12 +9751,6 @@
         </w:tc>
       </w:tr>
       <w:tr>
-        <w:tblPrEx>
-          <w:tblCellMar>
-            <w:top w:w="0" w:type="dxa"/>
-            <w:bottom w:w="0" w:type="dxa"/>
-          </w:tblCellMar>
-        </w:tblPrEx>
         <w:trPr>
           <w:cantSplit/>
         </w:trPr>
@@ -10160,12 +9881,6 @@
         </w:tc>
       </w:tr>
       <w:tr>
-        <w:tblPrEx>
-          <w:tblCellMar>
-            <w:top w:w="0" w:type="dxa"/>
-            <w:bottom w:w="0" w:type="dxa"/>
-          </w:tblCellMar>
-        </w:tblPrEx>
         <w:trPr>
           <w:cantSplit/>
         </w:trPr>
@@ -10287,12 +10002,6 @@
         </w:tc>
       </w:tr>
       <w:tr>
-        <w:tblPrEx>
-          <w:tblCellMar>
-            <w:top w:w="0" w:type="dxa"/>
-            <w:bottom w:w="0" w:type="dxa"/>
-          </w:tblCellMar>
-        </w:tblPrEx>
         <w:trPr>
           <w:cantSplit/>
         </w:trPr>
@@ -10414,12 +10123,6 @@
         </w:tc>
       </w:tr>
       <w:tr>
-        <w:tblPrEx>
-          <w:tblCellMar>
-            <w:top w:w="0" w:type="dxa"/>
-            <w:bottom w:w="0" w:type="dxa"/>
-          </w:tblCellMar>
-        </w:tblPrEx>
         <w:trPr>
           <w:cantSplit/>
         </w:trPr>
@@ -10542,12 +10245,6 @@
         </w:tc>
       </w:tr>
       <w:tr>
-        <w:tblPrEx>
-          <w:tblCellMar>
-            <w:top w:w="0" w:type="dxa"/>
-            <w:bottom w:w="0" w:type="dxa"/>
-          </w:tblCellMar>
-        </w:tblPrEx>
         <w:trPr>
           <w:cantSplit/>
         </w:trPr>
@@ -10669,12 +10366,6 @@
         </w:tc>
       </w:tr>
       <w:tr>
-        <w:tblPrEx>
-          <w:tblCellMar>
-            <w:top w:w="0" w:type="dxa"/>
-            <w:bottom w:w="0" w:type="dxa"/>
-          </w:tblCellMar>
-        </w:tblPrEx>
         <w:trPr>
           <w:cantSplit/>
         </w:trPr>
@@ -10812,12 +10503,6 @@
         </w:tc>
       </w:tr>
       <w:tr>
-        <w:tblPrEx>
-          <w:tblCellMar>
-            <w:top w:w="0" w:type="dxa"/>
-            <w:bottom w:w="0" w:type="dxa"/>
-          </w:tblCellMar>
-        </w:tblPrEx>
         <w:trPr>
           <w:cantSplit/>
         </w:trPr>
@@ -10948,12 +10633,6 @@
         </w:tc>
       </w:tr>
       <w:tr>
-        <w:tblPrEx>
-          <w:tblCellMar>
-            <w:top w:w="0" w:type="dxa"/>
-            <w:bottom w:w="0" w:type="dxa"/>
-          </w:tblCellMar>
-        </w:tblPrEx>
         <w:trPr>
           <w:cantSplit/>
         </w:trPr>
@@ -11091,12 +10770,6 @@
         </w:tc>
       </w:tr>
       <w:tr>
-        <w:tblPrEx>
-          <w:tblCellMar>
-            <w:top w:w="0" w:type="dxa"/>
-            <w:bottom w:w="0" w:type="dxa"/>
-          </w:tblCellMar>
-        </w:tblPrEx>
         <w:trPr>
           <w:cantSplit/>
         </w:trPr>
@@ -11575,12 +11248,6 @@
         <w:gridCol w:w="7226"/>
       </w:tblGrid>
       <w:tr>
-        <w:tblPrEx>
-          <w:tblCellMar>
-            <w:top w:w="0" w:type="dxa"/>
-            <w:bottom w:w="0" w:type="dxa"/>
-          </w:tblCellMar>
-        </w:tblPrEx>
         <w:trPr>
           <w:tblHeader/>
         </w:trPr>
@@ -11654,12 +11321,6 @@
         </w:tc>
       </w:tr>
       <w:tr>
-        <w:tblPrEx>
-          <w:tblCellMar>
-            <w:top w:w="0" w:type="dxa"/>
-            <w:bottom w:w="0" w:type="dxa"/>
-          </w:tblCellMar>
-        </w:tblPrEx>
         <w:trPr>
           <w:cantSplit/>
         </w:trPr>
@@ -11723,12 +11384,6 @@
         </w:tc>
       </w:tr>
       <w:tr>
-        <w:tblPrEx>
-          <w:tblCellMar>
-            <w:top w:w="0" w:type="dxa"/>
-            <w:bottom w:w="0" w:type="dxa"/>
-          </w:tblCellMar>
-        </w:tblPrEx>
         <w:trPr>
           <w:cantSplit/>
         </w:trPr>
@@ -11792,12 +11447,6 @@
         </w:tc>
       </w:tr>
       <w:tr>
-        <w:tblPrEx>
-          <w:tblCellMar>
-            <w:top w:w="0" w:type="dxa"/>
-            <w:bottom w:w="0" w:type="dxa"/>
-          </w:tblCellMar>
-        </w:tblPrEx>
         <w:trPr>
           <w:cantSplit/>
         </w:trPr>
@@ -11861,12 +11510,6 @@
         </w:tc>
       </w:tr>
       <w:tr>
-        <w:tblPrEx>
-          <w:tblCellMar>
-            <w:top w:w="0" w:type="dxa"/>
-            <w:bottom w:w="0" w:type="dxa"/>
-          </w:tblCellMar>
-        </w:tblPrEx>
         <w:trPr>
           <w:cantSplit/>
         </w:trPr>
@@ -11930,12 +11573,6 @@
         </w:tc>
       </w:tr>
       <w:tr>
-        <w:tblPrEx>
-          <w:tblCellMar>
-            <w:top w:w="0" w:type="dxa"/>
-            <w:bottom w:w="0" w:type="dxa"/>
-          </w:tblCellMar>
-        </w:tblPrEx>
         <w:trPr>
           <w:cantSplit/>
         </w:trPr>
@@ -12743,12 +12380,6 @@
         <w:gridCol w:w="4115"/>
       </w:tblGrid>
       <w:tr>
-        <w:tblPrEx>
-          <w:tblCellMar>
-            <w:top w:w="0" w:type="dxa"/>
-            <w:bottom w:w="0" w:type="dxa"/>
-          </w:tblCellMar>
-        </w:tblPrEx>
         <w:trPr>
           <w:trHeight w:val="278"/>
           <w:tblHeader/>
@@ -12891,12 +12522,6 @@
         </w:tc>
       </w:tr>
       <w:tr>
-        <w:tblPrEx>
-          <w:tblCellMar>
-            <w:top w:w="0" w:type="dxa"/>
-            <w:bottom w:w="0" w:type="dxa"/>
-          </w:tblCellMar>
-        </w:tblPrEx>
         <w:trPr>
           <w:cantSplit/>
           <w:trHeight w:val="1436"/>
@@ -13019,12 +12644,6 @@
         </w:tc>
       </w:tr>
       <w:tr>
-        <w:tblPrEx>
-          <w:tblCellMar>
-            <w:top w:w="0" w:type="dxa"/>
-            <w:bottom w:w="0" w:type="dxa"/>
-          </w:tblCellMar>
-        </w:tblPrEx>
         <w:trPr>
           <w:cantSplit/>
           <w:trHeight w:val="1214"/>
@@ -13147,12 +12766,6 @@
         </w:tc>
       </w:tr>
       <w:tr>
-        <w:tblPrEx>
-          <w:tblCellMar>
-            <w:top w:w="0" w:type="dxa"/>
-            <w:bottom w:w="0" w:type="dxa"/>
-          </w:tblCellMar>
-        </w:tblPrEx>
         <w:trPr>
           <w:cantSplit/>
           <w:trHeight w:val="1203"/>
@@ -13275,12 +12888,6 @@
         </w:tc>
       </w:tr>
       <w:tr>
-        <w:tblPrEx>
-          <w:tblCellMar>
-            <w:top w:w="0" w:type="dxa"/>
-            <w:bottom w:w="0" w:type="dxa"/>
-          </w:tblCellMar>
-        </w:tblPrEx>
         <w:trPr>
           <w:cantSplit/>
           <w:trHeight w:val="981"/>
@@ -15338,6 +14945,12 @@
       <w:footerReference w:type="default" r:id="rId29"/>
       <w:pgSz w:w="11906" w:h="16838"/>
       <w:pgMar w:top="1440" w:right="1440" w:bottom="1300" w:left="1440" w:header="708" w:footer="708" w:gutter="0"/>
+      <w:pgBorders w:offsetFrom="page">
+        <w:top w:val="dashDotStroked" w:sz="24" w:space="24" w:color="4472C4" w:themeColor="accent1"/>
+        <w:left w:val="dashDotStroked" w:sz="24" w:space="24" w:color="4472C4" w:themeColor="accent1"/>
+        <w:bottom w:val="dashDotStroked" w:sz="24" w:space="24" w:color="4472C4" w:themeColor="accent1"/>
+        <w:right w:val="dashDotStroked" w:sz="24" w:space="24" w:color="4472C4" w:themeColor="accent1"/>
+      </w:pgBorders>
       <w:cols w:space="720"/>
       <w:docGrid w:linePitch="360"/>
     </w:sectPr>

</xml_diff>